<commit_message>
update to dntp states
</commit_message>
<xml_diff>
--- a/safeHavens-and-eSTZwritR-FORMATTED.docx
+++ b/safeHavens-and-eSTZwritR-FORMATTED.docx
@@ -2477,9 +2477,9 @@
         <w:pStyle w:val="TextBody"/>
         <w:rPr/>
       </w:pPr>
-      <w:bookmarkStart w:id="11" w:name="estzwritr"/>
+      <w:bookmarkStart w:id="11" w:name="vector-data-field-attributes"/>
       <w:bookmarkStart w:id="12" w:name="discussion"/>
-      <w:bookmarkStart w:id="13" w:name="vector-data-field-attributes"/>
+      <w:bookmarkStart w:id="13" w:name="estzwritr"/>
       <w:r>
         <w:rPr/>
         <w:t>In addition to these standard field naming and placement conventions, we recommend standards for the contents of these essential fields and for the formatting of any additional fields relevant to the project (see the package website).</w:t>
@@ -5072,15 +5072,7 @@
     </w:pPr>
     <w:r>
       <w:rPr/>
-      <w:t xml:space="preserve">Benkendorf </w:t>
-    </w:r>
-    <w:r>
-      <w:rPr/>
-      <w:t>et al.</w:t>
-    </w:r>
-    <w:r>
-      <w:rPr/>
-      <w:t xml:space="preserve"> page </w:t>
+      <w:t xml:space="preserve">Benkendorf et al. page </w:t>
     </w:r>
     <w:r>
       <w:rPr/>

</xml_diff>